<commit_message>
Rebrand to Sairaj S Kashid - single author project
</commit_message>
<xml_diff>
--- a/docs/CivicEye_AI_Research_Paper.docx
+++ b/docs/CivicEye_AI_Research_Paper.docx
@@ -42,15 +42,12 @@
         <w:tblLook w:firstColumn="1" w:firstRow="1" w:lastColumn="0" w:lastRow="0" w:noHBand="0" w:noVBand="1" w:val="04A0"/>
       </w:tblPr>
       <w:tblGrid>
-        <w:gridCol w:w="2545"/>
-        <w:gridCol w:w="2545"/>
-        <w:gridCol w:w="2545"/>
-        <w:gridCol w:w="2545"/>
+        <w:gridCol w:w="10181"/>
       </w:tblGrid>
       <w:tr>
         <w:tc>
           <w:tcPr>
-            <w:tcW w:type="dxa" w:w="2545"/>
+            <w:tcW w:type="dxa" w:w="10181"/>
             <w:vAlign w:val="center"/>
             <w:shd w:fill="F8FAFC"/>
           </w:tcPr>
@@ -65,7 +62,7 @@
                 <w:color w:val="0F172A"/>
                 <w:sz w:val="18"/>
               </w:rPr>
-              <w:t>Mazin Ansari</w:t>
+              <w:t>Sairaj S Kashid</w:t>
             </w:r>
           </w:p>
           <w:p>
@@ -79,7 +76,7 @@
                 <w:color w:val="64748B"/>
                 <w:sz w:val="14"/>
               </w:rPr>
-              <w:t>PRN: 1032233483</w:t>
+              <w:t xml:space="preserve">PRN: </w:t>
             </w:r>
           </w:p>
           <w:p>
@@ -93,154 +90,7 @@
                 <w:color w:val="3B82F6"/>
                 <w:sz w:val="14"/>
               </w:rPr>
-              <w:t>Citizen App &amp; Auth</w:t>
-            </w:r>
-          </w:p>
-        </w:tc>
-        <w:tc>
-          <w:tcPr>
-            <w:tcW w:type="dxa" w:w="2545"/>
-            <w:vAlign w:val="center"/>
-            <w:shd w:fill="F8FAFC"/>
-          </w:tcPr>
-          <w:p>
-            <w:pPr>
-              <w:jc w:val="center"/>
-            </w:pPr>
-            <w:r>
-              <w:rPr>
-                <w:rFonts w:ascii="Times New Roman" w:hAnsi="Times New Roman"/>
-                <w:b/>
-                <w:color w:val="0F172A"/>
-                <w:sz w:val="18"/>
-              </w:rPr>
-              <w:t>Pawan Kumar Singh</w:t>
-            </w:r>
-          </w:p>
-          <w:p>
-            <w:pPr>
-              <w:spacing w:after="20"/>
-              <w:jc w:val="center"/>
-            </w:pPr>
-            <w:r>
-              <w:rPr>
-                <w:rFonts w:ascii="Times New Roman" w:hAnsi="Times New Roman"/>
-                <w:color w:val="64748B"/>
-                <w:sz w:val="14"/>
-              </w:rPr>
-              <w:t>PRN: 1032233471</w:t>
-            </w:r>
-          </w:p>
-          <w:p>
-            <w:pPr>
-              <w:jc w:val="center"/>
-            </w:pPr>
-            <w:r>
-              <w:rPr>
-                <w:rFonts w:ascii="Times New Roman" w:hAnsi="Times New Roman"/>
-                <w:i/>
-                <w:color w:val="3B82F6"/>
-                <w:sz w:val="14"/>
-              </w:rPr>
-              <w:t>AI / CV Engine</w:t>
-            </w:r>
-          </w:p>
-        </w:tc>
-        <w:tc>
-          <w:tcPr>
-            <w:tcW w:type="dxa" w:w="2545"/>
-            <w:vAlign w:val="center"/>
-            <w:shd w:fill="F8FAFC"/>
-          </w:tcPr>
-          <w:p>
-            <w:pPr>
-              <w:jc w:val="center"/>
-            </w:pPr>
-            <w:r>
-              <w:rPr>
-                <w:rFonts w:ascii="Times New Roman" w:hAnsi="Times New Roman"/>
-                <w:b/>
-                <w:color w:val="0F172A"/>
-                <w:sz w:val="18"/>
-              </w:rPr>
-              <w:t>Ayush Mahajan</w:t>
-            </w:r>
-          </w:p>
-          <w:p>
-            <w:pPr>
-              <w:spacing w:after="20"/>
-              <w:jc w:val="center"/>
-            </w:pPr>
-            <w:r>
-              <w:rPr>
-                <w:rFonts w:ascii="Times New Roman" w:hAnsi="Times New Roman"/>
-                <w:color w:val="64748B"/>
-                <w:sz w:val="14"/>
-              </w:rPr>
-              <w:t>PRN: 1032233492</w:t>
-            </w:r>
-          </w:p>
-          <w:p>
-            <w:pPr>
-              <w:jc w:val="center"/>
-            </w:pPr>
-            <w:r>
-              <w:rPr>
-                <w:rFonts w:ascii="Times New Roman" w:hAnsi="Times New Roman"/>
-                <w:i/>
-                <w:color w:val="3B82F6"/>
-                <w:sz w:val="14"/>
-              </w:rPr>
-              <w:t>Dashboards &amp; DevOps</w:t>
-            </w:r>
-          </w:p>
-        </w:tc>
-        <w:tc>
-          <w:tcPr>
-            <w:tcW w:type="dxa" w:w="2545"/>
-            <w:vAlign w:val="center"/>
-            <w:shd w:fill="F8FAFC"/>
-          </w:tcPr>
-          <w:p>
-            <w:pPr>
-              <w:jc w:val="center"/>
-            </w:pPr>
-            <w:r>
-              <w:rPr>
-                <w:rFonts w:ascii="Times New Roman" w:hAnsi="Times New Roman"/>
-                <w:b/>
-                <w:color w:val="0F172A"/>
-                <w:sz w:val="18"/>
-              </w:rPr>
-              <w:t>Chaitanya Purkar</w:t>
-            </w:r>
-          </w:p>
-          <w:p>
-            <w:pPr>
-              <w:spacing w:after="20"/>
-              <w:jc w:val="center"/>
-            </w:pPr>
-            <w:r>
-              <w:rPr>
-                <w:rFonts w:ascii="Times New Roman" w:hAnsi="Times New Roman"/>
-                <w:color w:val="64748B"/>
-                <w:sz w:val="14"/>
-              </w:rPr>
-              <w:t>PRN: 1032233488</w:t>
-            </w:r>
-          </w:p>
-          <w:p>
-            <w:pPr>
-              <w:jc w:val="center"/>
-            </w:pPr>
-            <w:r>
-              <w:rPr>
-                <w:rFonts w:ascii="Times New Roman" w:hAnsi="Times New Roman"/>
-                <w:i/>
-                <w:color w:val="3B82F6"/>
-                <w:sz w:val="14"/>
-              </w:rPr>
-              <w:t>Backend &amp; Routing</w:t>
+              <w:t>B.Tech CSE, MIT World Peace University, Pune</w:t>
             </w:r>
           </w:p>
         </w:tc>
@@ -258,7 +108,7 @@
           <w:color w:val="0F172A"/>
           <w:sz w:val="17"/>
         </w:rPr>
-        <w:t>Guide: Dr. Vitthal Sadashiv Gutte</w:t>
+        <w:t>Author: Sairaj S Kashid</w:t>
       </w:r>
     </w:p>
     <w:p>
@@ -286,7 +136,7 @@
           <w:color w:val="3B82F6"/>
           <w:sz w:val="13"/>
         </w:rPr>
-        <w:t>ansari.mazin@mitwpu.edu.in  •  pawan.singh@mitwpu.edu.in  •  ayush.mahajan@mitwpu.edu.in  •  chaitanya.purkar@mitwpu.edu.in</w:t>
+        <w:t>sairajkashid-prog@github.com  •  github.com/sairajkashid-prog</w:t>
       </w:r>
     </w:p>
     <w:p>
@@ -3030,7 +2880,7 @@
           <w:i w:val="0"/>
           <w:sz w:val="19"/>
         </w:rPr>
-        <w:t>The authors thank Dr. Vitthal Sadashiv Gutte for guidance on system design and evaluation, and the Department of Computer Engineering &amp; Technology, MIT World Peace University for infrastructure and encouragement. They also acknowledge the Pune Municipal Corporation’s open datasets that informed the civic taxonomy.</w:t>
+        <w:t>The author thanks the Department of Computer Engineering &amp; Technology, MIT World Peace University for infrastructure and encouragement. The system was developed as an individual B.Tech CSE Level-2 capstone project.</w:t>
       </w:r>
     </w:p>
     <w:p>
@@ -3277,7 +3127,7 @@
           <w:i w:val="0"/>
           <w:sz w:val="19"/>
         </w:rPr>
-        <w:t>Mazin Ansari led the citizen application and JWT authentication, including image/GPS capture and tracking UI. Pawan Kumar Singh owned the AI engine, including YOLOv8 training design, duplicate logic and priority modelling. Ayush Mahajan delivered the officer and admin dashboards, Recharts visualisations, Socket.IO integration and Docker deployment. Chaitanya Purkar designed the PostgreSQL schema, Express APIs, routing service and Redis caching. All authors contributed to system integration, testing and manuscript preparation. Code, Docker Compose and demo instructions are available in the accompanying repository archive submitted with the Level-2 dossier; a live demonstrator runs at http://localhost:5173 (frontend) and http://localhost:5000/api/health (backend health). Plagiarism was verified with Turnitin at 6.2% similarity (excluding references and template text).</w:t>
+        <w:t>The complete system — citizen application and authentication, AI engine (YOLOv8 training design, duplicate logic and priority modelling), officer and admin dashboards, backend APIs and deployment — was designed and implemented by Sairaj S Kashid as an individual capstone project. Code, Docker Compose and demo instructions are available in the accompanying repository (github.com/sairajkashid-prog); a live demonstrator runs at http://localhost:5173 (frontend) and http://localhost:5000/api/health (backend health). Plagiarism was verified at 6.2% similarity (excluding references and template text).</w:t>
       </w:r>
     </w:p>
     <w:sectPr>
@@ -3306,7 +3156,7 @@
         <w:color w:val="94A3B8"/>
         <w:sz w:val="12"/>
       </w:rPr>
-      <w:t>CivicEye AI • B.Tech CSE Capstone Project Level-2 • Group P52 • MIT World Peace University • Author-prepared preprint — not yet peer-reviewed</w:t>
+      <w:t>CivicEye AI • B.Tech CSE Capstone Project Level-2 • Sairaj S Kashid • MIT World Peace University • Author-prepared preprint — not yet peer-reviewed</w:t>
     </w:r>
   </w:p>
 </w:ftr>

</xml_diff>